<commit_message>
fix: progress report DOCX builder — remove duplicate tblW, fix footer fldChar XML structure
</commit_message>
<xml_diff>
--- a/docs/manuscript/SmartSpend_Progress_Report_Week4.docx
+++ b/docs/manuscript/SmartSpend_Progress_Report_Week4.docx
@@ -4,7 +4,6 @@
   <w:body>
     <w:tbl>
       <w:tblPr>
-        <w:tblW w:type="auto" w:w="0"/>
         <w:tblLook w:firstColumn="1" w:firstRow="1" w:lastColumn="0" w:lastRow="0" w:noHBand="0" w:noVBand="1" w:val="04A0"/>
         <w:tblW w:w="10224" w:type="dxa"/>
         <w:jc w:val="center"/>
@@ -122,7 +121,6 @@
     </w:p>
     <w:tbl>
       <w:tblPr>
-        <w:tblW w:type="auto" w:w="0"/>
         <w:tblLook w:firstColumn="1" w:firstRow="1" w:lastColumn="0" w:lastRow="0" w:noHBand="0" w:noVBand="1" w:val="04A0"/>
         <w:tblW w:w="10224" w:type="dxa"/>
         <w:tblBorders>
@@ -164,7 +162,6 @@
     <w:p/>
     <w:tbl>
       <w:tblPr>
-        <w:tblW w:type="auto" w:w="0"/>
         <w:tblLook w:firstColumn="1" w:firstRow="1" w:lastColumn="0" w:lastRow="0" w:noHBand="0" w:noVBand="1" w:val="04A0"/>
         <w:tblW w:w="10224" w:type="dxa"/>
         <w:tblBorders>
@@ -279,7 +276,6 @@
     </w:p>
     <w:tbl>
       <w:tblPr>
-        <w:tblW w:type="auto" w:w="0"/>
         <w:tblLook w:firstColumn="1" w:firstRow="1" w:lastColumn="0" w:lastRow="0" w:noHBand="0" w:noVBand="1" w:val="04A0"/>
         <w:tblW w:w="10224" w:type="dxa"/>
         <w:jc w:val="left"/>
@@ -437,7 +433,6 @@
     </w:p>
     <w:tbl>
       <w:tblPr>
-        <w:tblW w:type="auto" w:w="0"/>
         <w:tblLook w:firstColumn="1" w:firstRow="1" w:lastColumn="0" w:lastRow="0" w:noHBand="0" w:noVBand="1" w:val="04A0"/>
         <w:tblW w:w="10224" w:type="dxa"/>
         <w:tblBorders>
@@ -675,7 +670,6 @@
     </w:p>
     <w:tbl>
       <w:tblPr>
-        <w:tblW w:type="auto" w:w="0"/>
         <w:tblLook w:firstColumn="1" w:firstRow="1" w:lastColumn="0" w:lastRow="0" w:noHBand="0" w:noVBand="1" w:val="04A0"/>
         <w:tblW w:w="10224" w:type="dxa"/>
         <w:tblBorders>
@@ -866,7 +860,6 @@
     </w:p>
     <w:tbl>
       <w:tblPr>
-        <w:tblW w:type="auto" w:w="0"/>
         <w:tblLook w:firstColumn="1" w:firstRow="1" w:lastColumn="0" w:lastRow="0" w:noHBand="0" w:noVBand="1" w:val="04A0"/>
         <w:tblW w:w="10224" w:type="dxa"/>
         <w:tblBorders>
@@ -982,7 +975,6 @@
     </w:p>
     <w:tbl>
       <w:tblPr>
-        <w:tblW w:type="auto" w:w="0"/>
         <w:tblLook w:firstColumn="1" w:firstRow="1" w:lastColumn="0" w:lastRow="0" w:noHBand="0" w:noVBand="1" w:val="04A0"/>
         <w:tblW w:w="10224" w:type="dxa"/>
         <w:tblBorders>
@@ -1073,7 +1065,6 @@
     </w:p>
     <w:tbl>
       <w:tblPr>
-        <w:tblW w:type="auto" w:w="0"/>
         <w:tblLook w:firstColumn="1" w:firstRow="1" w:lastColumn="0" w:lastRow="0" w:noHBand="0" w:noVBand="1" w:val="04A0"/>
         <w:tblW w:w="10224" w:type="dxa"/>
         <w:tblBorders>
@@ -1164,7 +1155,6 @@
     </w:p>
     <w:tbl>
       <w:tblPr>
-        <w:tblW w:type="auto" w:w="0"/>
         <w:tblLook w:firstColumn="1" w:firstRow="1" w:lastColumn="0" w:lastRow="0" w:noHBand="0" w:noVBand="1" w:val="04A0"/>
         <w:tblW w:w="10224" w:type="dxa"/>
         <w:tblBorders>
@@ -1330,7 +1320,6 @@
     </w:p>
     <w:tbl>
       <w:tblPr>
-        <w:tblW w:type="auto" w:w="0"/>
         <w:tblLook w:firstColumn="1" w:firstRow="1" w:lastColumn="0" w:lastRow="0" w:noHBand="0" w:noVBand="1" w:val="04A0"/>
         <w:tblW w:w="10224" w:type="dxa"/>
         <w:tblBorders>
@@ -1602,7 +1591,6 @@
     <w:p/>
     <w:tbl>
       <w:tblPr>
-        <w:tblW w:type="auto" w:w="0"/>
         <w:tblLook w:firstColumn="1" w:firstRow="1" w:lastColumn="0" w:lastRow="0" w:noHBand="0" w:noVBand="1" w:val="04A0"/>
         <w:tblW w:w="10224" w:type="dxa"/>
         <w:tblBorders>
@@ -1767,9 +1755,6 @@
   <w:p>
     <w:pPr>
       <w:pStyle w:val="Footer"/>
-      <w:tabs>
-        <w:tab w:pos="10224" w:val="left"/>
-      </w:tabs>
       <w:spacing w:before="40" w:after="0"/>
     </w:pPr>
     <w:r>
@@ -1791,16 +1776,32 @@
       </w:rPr>
       <w:t xml:space="preserve">Page </w:t>
     </w:r>
-    <w:fldChar w:fldCharType="end"/>
-    <w:instrText> PAGE </w:instrText>
-    <w:fldChar w:fldCharType="begin"/>
     <w:r>
+      <w:fldChar w:fldCharType="begin"/>
+    </w:r>
+    <w:r>
+      <w:instrText xml:space="preserve"> PAGE </w:instrText>
+    </w:r>
+    <w:r>
+      <w:fldChar w:fldCharType="end"/>
+    </w:r>
+    <w:r>
+      <w:rPr>
+        <w:rFonts w:ascii="Tahoma" w:hAnsi="Tahoma"/>
+        <w:color w:val="6B6B6B"/>
+        <w:sz w:val="14"/>
+      </w:rPr>
       <w:t xml:space="preserve"> of </w:t>
     </w:r>
-    <w:r/>
-    <w:fldChar w:fldCharType="end"/>
-    <w:instrText> NUMPAGES </w:instrText>
-    <w:fldChar w:fldCharType="begin"/>
+    <w:r>
+      <w:fldChar w:fldCharType="begin"/>
+    </w:r>
+    <w:r>
+      <w:instrText xml:space="preserve"> NUMPAGES </w:instrText>
+    </w:r>
+    <w:r>
+      <w:fldChar w:fldCharType="end"/>
+    </w:r>
   </w:p>
 </w:ftr>
 </file>

</xml_diff>

<commit_message>
docs: rebuild progress reports Week4/5 with real app screenshots (6+8 images, accurate captions)
</commit_message>
<xml_diff>
--- a/docs/manuscript/SmartSpend_Progress_Report_Week4.docx
+++ b/docs/manuscript/SmartSpend_Progress_Report_Week4.docx
@@ -1315,7 +1315,7 @@
           <w:color w:val="6B6B6B"/>
           <w:sz w:val="18"/>
         </w:rPr>
-        <w:t>Attach clear photos showing actual progress of the project. Each photo should have a short caption describing what is shown. Add more rows if needed.</w:t>
+        <w:t>Attach clear photos showing actual progress of the project. Each photo should have a short caption describing what is shown.</w:t>
       </w:r>
     </w:p>
     <w:tbl>
@@ -1343,16 +1343,42 @@
           </w:tcPr>
           <w:p>
             <w:pPr>
-              <w:spacing w:before="720" w:after="720"/>
+              <w:spacing w:before="80" w:after="80"/>
               <w:jc w:val="center"/>
             </w:pPr>
             <w:r>
-              <w:rPr>
-                <w:rFonts w:ascii="Tahoma" w:hAnsi="Tahoma"/>
-                <w:color w:val="6B6B6B"/>
-                <w:sz w:val="17"/>
-              </w:rPr>
-              <w:t>[ Insert Photo 1 Here ]</w:t>
+              <w:drawing>
+                <wp:inline xmlns:a="http://schemas.openxmlformats.org/drawingml/2006/main" xmlns:pic="http://schemas.openxmlformats.org/drawingml/2006/picture">
+                  <wp:extent cx="2103120" cy="4673600"/>
+                  <wp:docPr id="1" name="Picture 1"/>
+                  <wp:cNvGraphicFramePr>
+                    <a:graphicFrameLocks noChangeAspect="1"/>
+                  </wp:cNvGraphicFramePr>
+                  <a:graphic>
+                    <a:graphicData uri="http://schemas.openxmlformats.org/drawingml/2006/picture">
+                      <pic:pic>
+                        <pic:nvPicPr>
+                          <pic:cNvPr id="0" name="Screenshot_2026-09-03-09-25-32-851_com.lucidframe.smartspend_app.jpg"/>
+                          <pic:cNvPicPr/>
+                        </pic:nvPicPr>
+                        <pic:blipFill>
+                          <a:blip r:embed="rId9"/>
+                          <a:stretch>
+                            <a:fillRect/>
+                          </a:stretch>
+                        </pic:blipFill>
+                        <pic:spPr>
+                          <a:xfrm>
+                            <a:off x="0" y="0"/>
+                            <a:ext cx="2103120" cy="4673600"/>
+                          </a:xfrm>
+                          <a:prstGeom prst="rect"/>
+                        </pic:spPr>
+                      </pic:pic>
+                    </a:graphicData>
+                  </a:graphic>
+                </wp:inline>
+              </w:drawing>
             </w:r>
           </w:p>
         </w:tc>
@@ -1363,16 +1389,42 @@
           </w:tcPr>
           <w:p>
             <w:pPr>
-              <w:spacing w:before="720" w:after="720"/>
+              <w:spacing w:before="80" w:after="80"/>
               <w:jc w:val="center"/>
             </w:pPr>
             <w:r>
-              <w:rPr>
-                <w:rFonts w:ascii="Tahoma" w:hAnsi="Tahoma"/>
-                <w:color w:val="6B6B6B"/>
-                <w:sz w:val="17"/>
-              </w:rPr>
-              <w:t>[ Insert Photo 2 Here ]</w:t>
+              <w:drawing>
+                <wp:inline xmlns:a="http://schemas.openxmlformats.org/drawingml/2006/main" xmlns:pic="http://schemas.openxmlformats.org/drawingml/2006/picture">
+                  <wp:extent cx="2103120" cy="4673600"/>
+                  <wp:docPr id="2" name="Picture 2"/>
+                  <wp:cNvGraphicFramePr>
+                    <a:graphicFrameLocks noChangeAspect="1"/>
+                  </wp:cNvGraphicFramePr>
+                  <a:graphic>
+                    <a:graphicData uri="http://schemas.openxmlformats.org/drawingml/2006/picture">
+                      <pic:pic>
+                        <pic:nvPicPr>
+                          <pic:cNvPr id="0" name="Screenshot_2026-09-03-09-25-37-741_com.lucidframe.smartspend_app.jpg"/>
+                          <pic:cNvPicPr/>
+                        </pic:nvPicPr>
+                        <pic:blipFill>
+                          <a:blip r:embed="rId10"/>
+                          <a:stretch>
+                            <a:fillRect/>
+                          </a:stretch>
+                        </pic:blipFill>
+                        <pic:spPr>
+                          <a:xfrm>
+                            <a:off x="0" y="0"/>
+                            <a:ext cx="2103120" cy="4673600"/>
+                          </a:xfrm>
+                          <a:prstGeom prst="rect"/>
+                        </pic:spPr>
+                      </pic:pic>
+                    </a:graphicData>
+                  </a:graphic>
+                </wp:inline>
+              </w:drawing>
             </w:r>
           </w:p>
         </w:tc>
@@ -1385,7 +1437,7 @@
           </w:tcPr>
           <w:p>
             <w:pPr>
-              <w:spacing w:before="240" w:after="240"/>
+              <w:spacing w:before="60" w:after="60"/>
               <w:jc w:val="left"/>
             </w:pPr>
             <w:r>
@@ -1394,7 +1446,7 @@
                 <w:color w:val="222222"/>
                 <w:sz w:val="18"/>
               </w:rPr>
-              <w:t xml:space="preserve">Caption: </w:t>
+              <w:t>Home screen — spending summary (₱185), multi-period spending limits, Quick Log chips, and achievement badges</w:t>
             </w:r>
           </w:p>
         </w:tc>
@@ -1405,7 +1457,7 @@
           </w:tcPr>
           <w:p>
             <w:pPr>
-              <w:spacing w:before="240" w:after="240"/>
+              <w:spacing w:before="60" w:after="60"/>
               <w:jc w:val="left"/>
             </w:pPr>
             <w:r>
@@ -1414,7 +1466,120 @@
                 <w:color w:val="222222"/>
                 <w:sz w:val="18"/>
               </w:rPr>
-              <w:t xml:space="preserve">Caption: </w:t>
+              <w:t>Home screen — Financial Health Score (64/100 Fair), Financial Management Score (88/100 Expert Tracker), daily quests, and weekly challenge</w:t>
+            </w:r>
+          </w:p>
+        </w:tc>
+      </w:tr>
+    </w:tbl>
+    <w:p/>
+    <w:tbl>
+      <w:tblPr>
+        <w:tblLook w:firstColumn="1" w:firstRow="1" w:lastColumn="0" w:lastRow="0" w:noHBand="0" w:noVBand="1" w:val="04A0"/>
+        <w:tblW w:w="10224" w:type="dxa"/>
+        <w:tblBorders>
+          <w:top w:val="single" w:sz="4" w:space="0" w:color="AAAAAA"/>
+          <w:left w:val="single" w:sz="4" w:space="0" w:color="AAAAAA"/>
+          <w:bottom w:val="single" w:sz="4" w:space="0" w:color="AAAAAA"/>
+          <w:right w:val="single" w:sz="4" w:space="0" w:color="AAAAAA"/>
+          <w:insideH w:val="single" w:sz="4" w:space="0" w:color="AAAAAA"/>
+          <w:insideV w:val="single" w:sz="4" w:space="0" w:color="AAAAAA"/>
+        </w:tblBorders>
+      </w:tblPr>
+      <w:tblGrid>
+        <w:gridCol w:w="5112"/>
+        <w:gridCol w:w="5112"/>
+      </w:tblGrid>
+      <w:tr>
+        <w:tc>
+          <w:tcPr>
+            <w:tcW w:type="dxa" w:w="5112"/>
+            <w:tcW w:w="5112" w:type="dxa"/>
+          </w:tcPr>
+          <w:p>
+            <w:pPr>
+              <w:spacing w:before="80" w:after="80"/>
+              <w:jc w:val="center"/>
+            </w:pPr>
+            <w:r>
+              <w:drawing>
+                <wp:inline xmlns:a="http://schemas.openxmlformats.org/drawingml/2006/main" xmlns:pic="http://schemas.openxmlformats.org/drawingml/2006/picture">
+                  <wp:extent cx="2103120" cy="4673600"/>
+                  <wp:docPr id="3" name="Picture 3"/>
+                  <wp:cNvGraphicFramePr>
+                    <a:graphicFrameLocks noChangeAspect="1"/>
+                  </wp:cNvGraphicFramePr>
+                  <a:graphic>
+                    <a:graphicData uri="http://schemas.openxmlformats.org/drawingml/2006/picture">
+                      <pic:pic>
+                        <pic:nvPicPr>
+                          <pic:cNvPr id="0" name="Screenshot_2026-09-03-09-25-47-423_com.lucidframe.smartspend_app.jpg"/>
+                          <pic:cNvPicPr/>
+                        </pic:nvPicPr>
+                        <pic:blipFill>
+                          <a:blip r:embed="rId11"/>
+                          <a:stretch>
+                            <a:fillRect/>
+                          </a:stretch>
+                        </pic:blipFill>
+                        <pic:spPr>
+                          <a:xfrm>
+                            <a:off x="0" y="0"/>
+                            <a:ext cx="2103120" cy="4673600"/>
+                          </a:xfrm>
+                          <a:prstGeom prst="rect"/>
+                        </pic:spPr>
+                      </pic:pic>
+                    </a:graphicData>
+                  </a:graphic>
+                </wp:inline>
+              </w:drawing>
+            </w:r>
+          </w:p>
+        </w:tc>
+        <w:tc>
+          <w:tcPr>
+            <w:tcW w:type="dxa" w:w="5112"/>
+            <w:tcW w:w="5112" w:type="dxa"/>
+          </w:tcPr>
+          <w:p>
+            <w:pPr>
+              <w:spacing w:before="80" w:after="80"/>
+              <w:jc w:val="center"/>
+            </w:pPr>
+            <w:r>
+              <w:drawing>
+                <wp:inline xmlns:a="http://schemas.openxmlformats.org/drawingml/2006/main" xmlns:pic="http://schemas.openxmlformats.org/drawingml/2006/picture">
+                  <wp:extent cx="2103120" cy="4673600"/>
+                  <wp:docPr id="4" name="Picture 4"/>
+                  <wp:cNvGraphicFramePr>
+                    <a:graphicFrameLocks noChangeAspect="1"/>
+                  </wp:cNvGraphicFramePr>
+                  <a:graphic>
+                    <a:graphicData uri="http://schemas.openxmlformats.org/drawingml/2006/picture">
+                      <pic:pic>
+                        <pic:nvPicPr>
+                          <pic:cNvPr id="0" name="Screenshot_2026-09-03-09-25-51-336_com.lucidframe.smartspend_app.jpg"/>
+                          <pic:cNvPicPr/>
+                        </pic:nvPicPr>
+                        <pic:blipFill>
+                          <a:blip r:embed="rId12"/>
+                          <a:stretch>
+                            <a:fillRect/>
+                          </a:stretch>
+                        </pic:blipFill>
+                        <pic:spPr>
+                          <a:xfrm>
+                            <a:off x="0" y="0"/>
+                            <a:ext cx="2103120" cy="4673600"/>
+                          </a:xfrm>
+                          <a:prstGeom prst="rect"/>
+                        </pic:spPr>
+                      </pic:pic>
+                    </a:graphicData>
+                  </a:graphic>
+                </wp:inline>
+              </w:drawing>
             </w:r>
           </w:p>
         </w:tc>
@@ -1427,16 +1592,16 @@
           </w:tcPr>
           <w:p>
             <w:pPr>
-              <w:spacing w:before="720" w:after="720"/>
-              <w:jc w:val="center"/>
+              <w:spacing w:before="60" w:after="60"/>
+              <w:jc w:val="left"/>
             </w:pPr>
             <w:r>
               <w:rPr>
                 <w:rFonts w:ascii="Tahoma" w:hAnsi="Tahoma"/>
-                <w:color w:val="6B6B6B"/>
-                <w:sz w:val="17"/>
+                <w:color w:val="222222"/>
+                <w:sz w:val="18"/>
               </w:rPr>
-              <w:t>[ Insert Photo 3 Here ]</w:t>
+              <w:t>Analytics — spending by category pie chart (12 categories) and This Month vs Last Month comparison table</w:t>
             </w:r>
           </w:p>
         </w:tc>
@@ -1447,16 +1612,129 @@
           </w:tcPr>
           <w:p>
             <w:pPr>
-              <w:spacing w:before="720" w:after="720"/>
-              <w:jc w:val="center"/>
+              <w:spacing w:before="60" w:after="60"/>
+              <w:jc w:val="left"/>
             </w:pPr>
             <w:r>
               <w:rPr>
                 <w:rFonts w:ascii="Tahoma" w:hAnsi="Tahoma"/>
-                <w:color w:val="6B6B6B"/>
-                <w:sz w:val="17"/>
+                <w:color w:val="222222"/>
+                <w:sz w:val="18"/>
               </w:rPr>
-              <w:t>[ Insert Photo 4 Here ]</w:t>
+              <w:t>Analytics — FHS Score Components breakdown (55/100) and Financial Management Score (FMS) full breakdown (88/100)</w:t>
+            </w:r>
+          </w:p>
+        </w:tc>
+      </w:tr>
+    </w:tbl>
+    <w:p/>
+    <w:tbl>
+      <w:tblPr>
+        <w:tblLook w:firstColumn="1" w:firstRow="1" w:lastColumn="0" w:lastRow="0" w:noHBand="0" w:noVBand="1" w:val="04A0"/>
+        <w:tblW w:w="10224" w:type="dxa"/>
+        <w:tblBorders>
+          <w:top w:val="single" w:sz="4" w:space="0" w:color="AAAAAA"/>
+          <w:left w:val="single" w:sz="4" w:space="0" w:color="AAAAAA"/>
+          <w:bottom w:val="single" w:sz="4" w:space="0" w:color="AAAAAA"/>
+          <w:right w:val="single" w:sz="4" w:space="0" w:color="AAAAAA"/>
+          <w:insideH w:val="single" w:sz="4" w:space="0" w:color="AAAAAA"/>
+          <w:insideV w:val="single" w:sz="4" w:space="0" w:color="AAAAAA"/>
+        </w:tblBorders>
+      </w:tblPr>
+      <w:tblGrid>
+        <w:gridCol w:w="5112"/>
+        <w:gridCol w:w="5112"/>
+      </w:tblGrid>
+      <w:tr>
+        <w:tc>
+          <w:tcPr>
+            <w:tcW w:type="dxa" w:w="5112"/>
+            <w:tcW w:w="5112" w:type="dxa"/>
+          </w:tcPr>
+          <w:p>
+            <w:pPr>
+              <w:spacing w:before="80" w:after="80"/>
+              <w:jc w:val="center"/>
+            </w:pPr>
+            <w:r>
+              <w:drawing>
+                <wp:inline xmlns:a="http://schemas.openxmlformats.org/drawingml/2006/main" xmlns:pic="http://schemas.openxmlformats.org/drawingml/2006/picture">
+                  <wp:extent cx="2103120" cy="4673600"/>
+                  <wp:docPr id="5" name="Picture 5"/>
+                  <wp:cNvGraphicFramePr>
+                    <a:graphicFrameLocks noChangeAspect="1"/>
+                  </wp:cNvGraphicFramePr>
+                  <a:graphic>
+                    <a:graphicData uri="http://schemas.openxmlformats.org/drawingml/2006/picture">
+                      <pic:pic>
+                        <pic:nvPicPr>
+                          <pic:cNvPr id="0" name="Screenshot_2026-09-03-09-26-42-898_com.lucidframe.smartspend_app.jpg"/>
+                          <pic:cNvPicPr/>
+                        </pic:nvPicPr>
+                        <pic:blipFill>
+                          <a:blip r:embed="rId13"/>
+                          <a:stretch>
+                            <a:fillRect/>
+                          </a:stretch>
+                        </pic:blipFill>
+                        <pic:spPr>
+                          <a:xfrm>
+                            <a:off x="0" y="0"/>
+                            <a:ext cx="2103120" cy="4673600"/>
+                          </a:xfrm>
+                          <a:prstGeom prst="rect"/>
+                        </pic:spPr>
+                      </pic:pic>
+                    </a:graphicData>
+                  </a:graphic>
+                </wp:inline>
+              </w:drawing>
+            </w:r>
+          </w:p>
+        </w:tc>
+        <w:tc>
+          <w:tcPr>
+            <w:tcW w:type="dxa" w:w="5112"/>
+            <w:tcW w:w="5112" w:type="dxa"/>
+          </w:tcPr>
+          <w:p>
+            <w:pPr>
+              <w:spacing w:before="80" w:after="80"/>
+              <w:jc w:val="center"/>
+            </w:pPr>
+            <w:r>
+              <w:drawing>
+                <wp:inline xmlns:a="http://schemas.openxmlformats.org/drawingml/2006/main" xmlns:pic="http://schemas.openxmlformats.org/drawingml/2006/picture">
+                  <wp:extent cx="2103120" cy="4673600"/>
+                  <wp:docPr id="6" name="Picture 6"/>
+                  <wp:cNvGraphicFramePr>
+                    <a:graphicFrameLocks noChangeAspect="1"/>
+                  </wp:cNvGraphicFramePr>
+                  <a:graphic>
+                    <a:graphicData uri="http://schemas.openxmlformats.org/drawingml/2006/picture">
+                      <pic:pic>
+                        <pic:nvPicPr>
+                          <pic:cNvPr id="0" name="Screenshot_2026-09-03-09-26-28-711_com.lucidframe.smartspend_app.jpg"/>
+                          <pic:cNvPicPr/>
+                        </pic:nvPicPr>
+                        <pic:blipFill>
+                          <a:blip r:embed="rId14"/>
+                          <a:stretch>
+                            <a:fillRect/>
+                          </a:stretch>
+                        </pic:blipFill>
+                        <pic:spPr>
+                          <a:xfrm>
+                            <a:off x="0" y="0"/>
+                            <a:ext cx="2103120" cy="4673600"/>
+                          </a:xfrm>
+                          <a:prstGeom prst="rect"/>
+                        </pic:spPr>
+                      </pic:pic>
+                    </a:graphicData>
+                  </a:graphic>
+                </wp:inline>
+              </w:drawing>
             </w:r>
           </w:p>
         </w:tc>
@@ -1469,7 +1747,7 @@
           </w:tcPr>
           <w:p>
             <w:pPr>
-              <w:spacing w:before="240" w:after="240"/>
+              <w:spacing w:before="60" w:after="60"/>
               <w:jc w:val="left"/>
             </w:pPr>
             <w:r>
@@ -1478,7 +1756,7 @@
                 <w:color w:val="222222"/>
                 <w:sz w:val="18"/>
               </w:rPr>
-              <w:t xml:space="preserve">Caption: </w:t>
+              <w:t>App Settings — AI model selector showing Gemini 3.1 Flash-Lite as primary (1,000/day free), with 4 fallback providers listed</w:t>
             </w:r>
           </w:p>
         </w:tc>
@@ -1489,7 +1767,7 @@
           </w:tcPr>
           <w:p>
             <w:pPr>
-              <w:spacing w:before="240" w:after="240"/>
+              <w:spacing w:before="60" w:after="60"/>
               <w:jc w:val="left"/>
             </w:pPr>
             <w:r>
@@ -1498,96 +1776,13 @@
                 <w:color w:val="222222"/>
                 <w:sz w:val="18"/>
               </w:rPr>
-              <w:t xml:space="preserve">Caption: </w:t>
-            </w:r>
-          </w:p>
-        </w:tc>
-      </w:tr>
-      <w:tr>
-        <w:tc>
-          <w:tcPr>
-            <w:tcW w:type="dxa" w:w="5112"/>
-            <w:tcW w:w="5112" w:type="dxa"/>
-          </w:tcPr>
-          <w:p>
-            <w:pPr>
-              <w:spacing w:before="720" w:after="720"/>
-              <w:jc w:val="center"/>
-            </w:pPr>
-            <w:r>
-              <w:rPr>
-                <w:rFonts w:ascii="Tahoma" w:hAnsi="Tahoma"/>
-                <w:color w:val="6B6B6B"/>
-                <w:sz w:val="17"/>
-              </w:rPr>
-              <w:t>[ Insert Photo 5 Here ]</w:t>
-            </w:r>
-          </w:p>
-        </w:tc>
-        <w:tc>
-          <w:tcPr>
-            <w:tcW w:type="dxa" w:w="5112"/>
-            <w:tcW w:w="5112" w:type="dxa"/>
-          </w:tcPr>
-          <w:p>
-            <w:pPr>
-              <w:spacing w:before="720" w:after="720"/>
-              <w:jc w:val="center"/>
-            </w:pPr>
-            <w:r>
-              <w:rPr>
-                <w:rFonts w:ascii="Tahoma" w:hAnsi="Tahoma"/>
-                <w:color w:val="6B6B6B"/>
-                <w:sz w:val="17"/>
-              </w:rPr>
-              <w:t>[ Insert Photo 6 Here ]</w:t>
-            </w:r>
-          </w:p>
-        </w:tc>
-      </w:tr>
-      <w:tr>
-        <w:tc>
-          <w:tcPr>
-            <w:tcW w:type="dxa" w:w="5112"/>
-            <w:tcW w:w="5112" w:type="dxa"/>
-          </w:tcPr>
-          <w:p>
-            <w:pPr>
-              <w:spacing w:before="240" w:after="240"/>
-              <w:jc w:val="left"/>
-            </w:pPr>
-            <w:r>
-              <w:rPr>
-                <w:rFonts w:ascii="Tahoma" w:hAnsi="Tahoma"/>
-                <w:color w:val="222222"/>
-                <w:sz w:val="18"/>
-              </w:rPr>
-              <w:t xml:space="preserve">Caption: </w:t>
-            </w:r>
-          </w:p>
-        </w:tc>
-        <w:tc>
-          <w:tcPr>
-            <w:tcW w:type="dxa" w:w="5112"/>
-            <w:tcW w:w="5112" w:type="dxa"/>
-          </w:tcPr>
-          <w:p>
-            <w:pPr>
-              <w:spacing w:before="240" w:after="240"/>
-              <w:jc w:val="left"/>
-            </w:pPr>
-            <w:r>
-              <w:rPr>
-                <w:rFonts w:ascii="Tahoma" w:hAnsi="Tahoma"/>
-                <w:color w:val="222222"/>
-                <w:sz w:val="18"/>
-              </w:rPr>
-              <w:t xml:space="preserve">Caption: </w:t>
+              <w:t>Profile screen — FMS breakdown (88/100: Logging 13/25, Budget Setup 25/25, Goal Tracking 25/25, Data Completeness 25/25)</w:t>
             </w:r>
           </w:p>
         </w:tc>
       </w:tr>
     </w:tbl>
+    <w:p/>
     <w:p/>
     <w:tbl>
       <w:tblPr>
@@ -1740,7 +1935,7 @@
       </w:tr>
     </w:tbl>
     <w:sectPr>
-      <w:footerReference w:type="default" r:id="rId9"/>
+      <w:footerReference w:type="default" r:id="rId15"/>
       <w:pgSz w:w="12240" w:h="15840"/>
       <w:pgMar w:top="1008" w:right="1008" w:bottom="1008" w:left="1008" w:header="720" w:footer="720" w:gutter="0"/>
       <w:cols w:space="720"/>

</xml_diff>